<commit_message>
Roteiros de YouTube (Eduardo, Gaspar, Deltan) e 6 análises de repercussão para Instagram; correção no roteiro do Eduardo
Co-Authored-By: Claude Opus 5.5 <noreply@anthropic.com>
Claude-Session: https://claude.ai/code/session_01EGrxw11y1RieUGZ6R9XQan
</commit_message>
<xml_diff>
--- a/roteiros/curtos/ROTEIROS_POLEMICAS_11102026.docx
+++ b/roteiros/curtos/ROTEIROS_POLEMICAS_11102026.docx
@@ -101,7 +101,7 @@
           <w:sz w:val="24"/>
           <w:szCs w:val="24"/>
         </w:rPr>
-        <w:t xml:space="preserve">O STF entendeu diferente. Para o Moraes, o crime é formal: não precisa provar que algum ministro se sentiu intimidado. Basta a ameaça ser crível e ter o objetivo de interferir no julgamento.</w:t>
+        <w:t xml:space="preserve">O STF entendeu diferente. O Moraes disse no voto que “não é função de deputado federal brasileiro fazer lobby no exterior contra o próprio país”. E a Primeira Turma inteira entendeu que essas articulações foram, sim, uma ameaça ao julgamento.</w:t>
       </w:r>
     </w:p>
     <w:p>
@@ -129,7 +129,7 @@
           <w:sz w:val="24"/>
           <w:szCs w:val="24"/>
         </w:rPr>
-        <w:t xml:space="preserve">E ele vai ser preso? Pra isso, o Brasil precisa pedir a extradição. Existe um tratado entre Brasil e Estados Unidos, dos anos 60, que não permite extradição quando o crime tem caráter político. Quem analisa primeiro é um juiz americano e, no fim, o governo americano. Enquanto isso, o nome dele fica no banco nacional de mandados: se pisar no Brasil, é preso.</w:t>
+        <w:t xml:space="preserve">E ele vai ser preso? Pra isso, o Brasil precisa pedir a extradição. Existe um tratado entre Brasil e Estados Unidos, dos anos 60. Segundo especialistas, esse crime nem está na lista dos crimes que permitem extradição, e o tratado não permite extradição por crime político. Quem analisa primeiro é um juiz americano e, no fim, o governo americano. Enquanto isso, o nome dele fica no banco nacional de mandados: se pisar no Brasil, é preso.</w:t>
       </w:r>
     </w:p>
     <w:p>
@@ -184,7 +184,7 @@
           <w:sz w:val="16"/>
           <w:szCs w:val="16"/>
         </w:rPr>
-        <w:t xml:space="preserve">Base: AP 2.782 (STF, 1ª Turma, unânime, 16/6/2026): 4 anos e 2 meses, semiaberto, 50 dias-multa, coação no curso do processo (CP, art. 344, c/c art. 71); inelegibilidade (LC 64/1990) e perda do cargo de escrivão da PF; embargos rejeitados no Plenário Virtual de 11 a 18/9 (4 x 0); trânsito em julgado em 3/10; mandado de prisão e cancelamento dos passaportes em 7–8/10 (as fontes divergem no dia); nome no BNMP. Voto de Moraes: crime formal, basta 'ameaça crível' para interferir no julgamento. Defesa (DPU): liberdade de expressão. Eduardo chamou a decisão de 'arbitrária'. Ele já havia perdido o mandato por faltas. CF, art. 5º, XXXIX (legalidade) e art. 15, III (suspensão dos direitos políticos). Tratado de extradição Brasil–EUA (assinado em 1961, em vigor desde 1964, Decreto 55.750/1965): veda a extradição por crime de caráter político; não há definição fechada; o juiz americano decide se é extraditável e o Secretário de Estado decide a entrega; green card não impede o pedido. 🟡 Críticos dirão que o STF tratou como crime comum e que a ameaça seria 'crível' pelas sanções aplicadas; resposta: a discussão jurídica é sobre o alcance de 'grave ameaça', e o vídeo apresenta como opinião. Não mencionar tarifaço.</w:t>
+        <w:t xml:space="preserve">Base: AP 2.782 (STF, 1ª Turma, unânime, 16/6/2026): 4 anos e 2 meses, semiaberto, 50 dias-multa, coação no curso do processo (CP, art. 344, c/c art. 71); inelegibilidade (LC 64/1990) e perda do cargo de escrivão da PF; embargos rejeitados no Plenário Virtual de 11 a 18/9 (4 x 0); trânsito em julgado em 3/10; mandado de prisão e cancelamento dos passaportes em 7–8/10 (as fontes divergem no dia); nome no BNMP. Frase de Moraes no voto (Poder360): 'Não é função de deputado federal brasileiro fazer lobby no exterior contra o próprio país'. CORRIGIDO em 11/10: as expressões 'crime formal' e 'ameaça crível' não foram confirmadas como palavras do voto e saíram do texto. Extradição: segundo o professor João Pedro Pádua (UFF), ouvido pela AP, a coação no curso do processo não está na lista de crimes do tratado; o texto oficial do tratado não pôde ser lido aqui (sites bloqueados). Defesa (DPU): liberdade de expressão. Eduardo chamou a decisão de 'arbitrária'. Ele já havia perdido o mandato por faltas. CF, art. 5º, XXXIX (legalidade) e art. 15, III (suspensão dos direitos políticos). Tratado de extradição Brasil–EUA (assinado em 1961, em vigor desde 1964, Decreto 55.750/1965): veda a extradição por crime de caráter político; não há definição fechada; o juiz americano decide se é extraditável e o Secretário de Estado decide a entrega; green card não impede o pedido. 🟡 Críticos dirão que a ameaça era real porque as sanções foram aplicadas; resposta: a discussão jurídica é sobre o alcance de 'grave ameaça', e o vídeo apresenta como opinião. Não mencionar tarifaço.</w:t>
       </w:r>
     </w:p>
     <w:p>

</xml_diff>